<commit_message>
v5.0 F1: wire filter params to DB WHERE clause
- dbTypes: add keyword/size/industry/employmentType to listRecruitmentNews opts
- neonBackend: COALESCE null-check pattern for dynamic WHERE (no SQL injection)
- mockBackend: JS-level filter matching same logic
- api/trends: pass size/keyword/employmentType from query params to db
- TrendDashboardPage: keyword search bar + 고용형태 filter row, all params wired to API

Co-Authored-By: Claude Sonnet 4.6 <noreply@anthropic.com>
</commit_message>
<xml_diff>
--- a/잡트렌드 260630.docx
+++ b/잡트렌드 260630.docx
@@ -3,248 +3,1081 @@
 <w:document xmlns:wpc="http://schemas.microsoft.com/office/word/2010/wordprocessingCanvas" xmlns:cx="http://schemas.microsoft.com/office/drawing/2014/chartex" xmlns:cx1="http://schemas.microsoft.com/office/drawing/2015/9/8/chartex" xmlns:cx2="http://schemas.microsoft.com/office/drawing/2015/10/21/chartex" xmlns:cx3="http://schemas.microsoft.com/office/drawing/2016/5/9/chartex" xmlns:cx4="http://schemas.microsoft.com/office/drawing/2016/5/10/chartex" xmlns:cx5="http://schemas.microsoft.com/office/drawing/2016/5/11/chartex" xmlns:cx6="http://schemas.microsoft.com/office/drawing/2016/5/12/chartex" xmlns:cx7="http://schemas.microsoft.com/office/drawing/2016/5/13/chartex" xmlns:cx8="http://schemas.microsoft.com/office/drawing/2016/5/14/chartex" xmlns:mc="http://schemas.openxmlformats.org/markup-compatibility/2006" xmlns:aink="http://schemas.microsoft.com/office/drawing/2016/ink" xmlns:am3d="http://schemas.microsoft.com/office/drawing/2017/model3d" xmlns:o="urn:schemas-microsoft-com:office:office" xmlns:r="http://schemas.openxmlformats.org/officeDocument/2006/relationships" xmlns:m="http://schemas.openxmlformats.org/officeDocument/2006/math" xmlns:v="urn:schemas-microsoft-com:vml" xmlns:wp14="http://schemas.microsoft.com/office/word/2010/wordprocessingDrawing" xmlns:wp="http://schemas.openxmlformats.org/drawingml/2006/wordprocessingDrawing" xmlns:w10="urn:schemas-microsoft-com:office:word" xmlns:w="http://schemas.openxmlformats.org/wordprocessingml/2006/main" xmlns:w14="http://schemas.microsoft.com/office/word/2010/wordml" xmlns:w15="http://schemas.microsoft.com/office/word/2012/wordml" xmlns:w16cid="http://schemas.microsoft.com/office/word/2016/wordml/cid" xmlns:w16se="http://schemas.microsoft.com/office/word/2015/wordml/symex" xmlns:wpg="http://schemas.microsoft.com/office/word/2010/wordprocessingGroup" xmlns:wpi="http://schemas.microsoft.com/office/word/2010/wordprocessingInk" xmlns:wne="http://schemas.microsoft.com/office/word/2006/wordml" xmlns:wps="http://schemas.microsoft.com/office/word/2010/wordprocessingShape" mc:Ignorable="w14 w15 w16se w16cid wp14">
   <w:body>
     <w:p>
+      <w:pPr>
+        <w:rPr>
+          <w:rFonts w:asciiTheme="minorEastAsia" w:hAnsiTheme="minorEastAsia"/>
+          <w:szCs w:val="20"/>
+        </w:rPr>
+      </w:pPr>
       <w:bookmarkStart w:id="0" w:name="_GoBack"/>
       <w:r>
+        <w:rPr>
+          <w:rFonts w:asciiTheme="minorEastAsia" w:hAnsiTheme="minorEastAsia"/>
+          <w:szCs w:val="20"/>
+        </w:rPr>
         <w:t xml:space="preserve"># </w:t>
       </w:r>
       <w:proofErr w:type="spellStart"/>
       <w:r>
+        <w:rPr>
+          <w:rFonts w:asciiTheme="minorEastAsia" w:hAnsiTheme="minorEastAsia"/>
+          <w:szCs w:val="20"/>
+        </w:rPr>
         <w:t>잡트렌드</w:t>
       </w:r>
       <w:proofErr w:type="spellEnd"/>
       <w:r>
+        <w:rPr>
+          <w:rFonts w:asciiTheme="minorEastAsia" w:hAnsiTheme="minorEastAsia"/>
+          <w:szCs w:val="20"/>
+        </w:rPr>
         <w:t xml:space="preserve"> — 앱 소개서</w:t>
       </w:r>
     </w:p>
-    <w:bookmarkEnd w:id="0"/>
-    <w:p/>
-    <w:p>
-      <w:r>
+    <w:p>
+      <w:pPr>
+        <w:rPr>
+          <w:rFonts w:asciiTheme="minorEastAsia" w:hAnsiTheme="minorEastAsia"/>
+          <w:szCs w:val="20"/>
+        </w:rPr>
+      </w:pPr>
+    </w:p>
+    <w:p>
+      <w:pPr>
+        <w:rPr>
+          <w:rFonts w:asciiTheme="minorEastAsia" w:hAnsiTheme="minorEastAsia"/>
+          <w:szCs w:val="20"/>
+        </w:rPr>
+      </w:pPr>
+      <w:r>
+        <w:rPr>
+          <w:rFonts w:asciiTheme="minorEastAsia" w:hAnsiTheme="minorEastAsia"/>
+          <w:szCs w:val="20"/>
+        </w:rPr>
         <w:t>## 서비스 소개</w:t>
       </w:r>
     </w:p>
     <w:p>
-      <w:r>
-        <w:rPr>
-          <w:rFonts w:hint="eastAsia"/>
+      <w:pPr>
+        <w:rPr>
+          <w:rFonts w:asciiTheme="minorEastAsia" w:hAnsiTheme="minorEastAsia"/>
+          <w:szCs w:val="20"/>
+        </w:rPr>
+      </w:pPr>
+      <w:r>
+        <w:rPr>
+          <w:rFonts w:asciiTheme="minorEastAsia" w:hAnsiTheme="minorEastAsia" w:hint="eastAsia"/>
+          <w:szCs w:val="20"/>
         </w:rPr>
         <w:t>구직자를</w:t>
       </w:r>
       <w:r>
+        <w:rPr>
+          <w:rFonts w:asciiTheme="minorEastAsia" w:hAnsiTheme="minorEastAsia"/>
+          <w:szCs w:val="20"/>
+        </w:rPr>
         <w:t xml:space="preserve"> 위한 채용 트렌드 </w:t>
       </w:r>
       <w:proofErr w:type="spellStart"/>
       <w:r>
+        <w:rPr>
+          <w:rFonts w:asciiTheme="minorEastAsia" w:hAnsiTheme="minorEastAsia"/>
+          <w:szCs w:val="20"/>
+        </w:rPr>
         <w:t>인텔리전스</w:t>
       </w:r>
       <w:proofErr w:type="spellEnd"/>
       <w:r>
+        <w:rPr>
+          <w:rFonts w:asciiTheme="minorEastAsia" w:hAnsiTheme="minorEastAsia"/>
+          <w:szCs w:val="20"/>
+        </w:rPr>
         <w:t xml:space="preserve"> 서비스. 지금 어떤 공고가 있는지,</w:t>
       </w:r>
     </w:p>
     <w:p>
-      <w:r>
-        <w:rPr>
-          <w:rFonts w:hint="eastAsia"/>
+      <w:pPr>
+        <w:rPr>
+          <w:rFonts w:asciiTheme="minorEastAsia" w:hAnsiTheme="minorEastAsia"/>
+          <w:szCs w:val="20"/>
+        </w:rPr>
+      </w:pPr>
+      <w:r>
+        <w:rPr>
+          <w:rFonts w:asciiTheme="minorEastAsia" w:hAnsiTheme="minorEastAsia" w:hint="eastAsia"/>
+          <w:szCs w:val="20"/>
         </w:rPr>
         <w:t>어떤</w:t>
       </w:r>
       <w:r>
+        <w:rPr>
+          <w:rFonts w:asciiTheme="minorEastAsia" w:hAnsiTheme="minorEastAsia"/>
+          <w:szCs w:val="20"/>
+        </w:rPr>
         <w:t xml:space="preserve"> 자격요건이 필요한지 보여주고, AI 모의면접까지 지원합니다.</w:t>
       </w:r>
     </w:p>
-    <w:p/>
-    <w:p>
-      <w:r>
+    <w:p>
+      <w:pPr>
+        <w:rPr>
+          <w:rFonts w:asciiTheme="minorEastAsia" w:hAnsiTheme="minorEastAsia"/>
+          <w:szCs w:val="20"/>
+        </w:rPr>
+      </w:pPr>
+    </w:p>
+    <w:p>
+      <w:pPr>
+        <w:rPr>
+          <w:rFonts w:asciiTheme="minorEastAsia" w:hAnsiTheme="minorEastAsia"/>
+          <w:szCs w:val="20"/>
+        </w:rPr>
+      </w:pPr>
+      <w:r>
+        <w:rPr>
+          <w:rFonts w:asciiTheme="minorEastAsia" w:hAnsiTheme="minorEastAsia"/>
+          <w:szCs w:val="20"/>
+        </w:rPr>
         <w:t>## 해결하는 문제</w:t>
       </w:r>
     </w:p>
     <w:p>
-      <w:r>
-        <w:rPr>
-          <w:rFonts w:hint="eastAsia"/>
+      <w:pPr>
+        <w:rPr>
+          <w:rFonts w:asciiTheme="minorEastAsia" w:hAnsiTheme="minorEastAsia"/>
+          <w:szCs w:val="20"/>
+        </w:rPr>
+      </w:pPr>
+      <w:r>
+        <w:rPr>
+          <w:rFonts w:asciiTheme="minorEastAsia" w:hAnsiTheme="minorEastAsia" w:hint="eastAsia"/>
+          <w:szCs w:val="20"/>
         </w:rPr>
         <w:t>기업은</w:t>
       </w:r>
       <w:r>
+        <w:rPr>
+          <w:rFonts w:asciiTheme="minorEastAsia" w:hAnsiTheme="minorEastAsia"/>
+          <w:szCs w:val="20"/>
+        </w:rPr>
         <w:t xml:space="preserve"> ATS로 지원자를 정교하게 거르지만, 구직자는 "이 직무에 합격하려면</w:t>
       </w:r>
     </w:p>
     <w:p>
-      <w:r>
-        <w:rPr>
-          <w:rFonts w:hint="eastAsia"/>
+      <w:pPr>
+        <w:rPr>
+          <w:rFonts w:asciiTheme="minorEastAsia" w:hAnsiTheme="minorEastAsia"/>
+          <w:szCs w:val="20"/>
+        </w:rPr>
+      </w:pPr>
+      <w:r>
+        <w:rPr>
+          <w:rFonts w:asciiTheme="minorEastAsia" w:hAnsiTheme="minorEastAsia" w:hint="eastAsia"/>
+          <w:szCs w:val="20"/>
         </w:rPr>
         <w:t>무엇이</w:t>
       </w:r>
       <w:r>
+        <w:rPr>
+          <w:rFonts w:asciiTheme="minorEastAsia" w:hAnsiTheme="minorEastAsia"/>
+          <w:szCs w:val="20"/>
+        </w:rPr>
         <w:t xml:space="preserve"> 필요한지" 알 도구가 없습니다. </w:t>
       </w:r>
       <w:proofErr w:type="spellStart"/>
       <w:r>
+        <w:rPr>
+          <w:rFonts w:asciiTheme="minorEastAsia" w:hAnsiTheme="minorEastAsia"/>
+          <w:szCs w:val="20"/>
+        </w:rPr>
         <w:t>잡트렌드는</w:t>
       </w:r>
       <w:proofErr w:type="spellEnd"/>
       <w:r>
+        <w:rPr>
+          <w:rFonts w:asciiTheme="minorEastAsia" w:hAnsiTheme="minorEastAsia"/>
+          <w:szCs w:val="20"/>
+        </w:rPr>
         <w:t xml:space="preserve"> 이 정보 비대칭을 줄입니다.</w:t>
       </w:r>
     </w:p>
-    <w:p/>
-    <w:p>
-      <w:r>
+    <w:p>
+      <w:pPr>
+        <w:rPr>
+          <w:rFonts w:asciiTheme="minorEastAsia" w:hAnsiTheme="minorEastAsia"/>
+          <w:szCs w:val="20"/>
+        </w:rPr>
+      </w:pPr>
+    </w:p>
+    <w:p>
+      <w:pPr>
+        <w:rPr>
+          <w:rFonts w:asciiTheme="minorEastAsia" w:hAnsiTheme="minorEastAsia"/>
+          <w:szCs w:val="20"/>
+        </w:rPr>
+      </w:pPr>
+      <w:r>
+        <w:rPr>
+          <w:rFonts w:asciiTheme="minorEastAsia" w:hAnsiTheme="minorEastAsia"/>
+          <w:szCs w:val="20"/>
+        </w:rPr>
         <w:t>## 핵심 기능</w:t>
       </w:r>
     </w:p>
     <w:p>
-      <w:r>
+      <w:pPr>
+        <w:rPr>
+          <w:rFonts w:asciiTheme="minorEastAsia" w:hAnsiTheme="minorEastAsia"/>
+          <w:szCs w:val="20"/>
+        </w:rPr>
+      </w:pPr>
+      <w:r>
+        <w:rPr>
+          <w:rFonts w:asciiTheme="minorEastAsia" w:hAnsiTheme="minorEastAsia"/>
+          <w:szCs w:val="20"/>
+        </w:rPr>
         <w:t xml:space="preserve">1. 채용 트렌드 대시보드 — </w:t>
       </w:r>
       <w:proofErr w:type="spellStart"/>
       <w:r>
+        <w:rPr>
+          <w:rFonts w:asciiTheme="minorEastAsia" w:hAnsiTheme="minorEastAsia"/>
+          <w:szCs w:val="20"/>
+        </w:rPr>
         <w:t>직무별</w:t>
       </w:r>
       <w:proofErr w:type="spellEnd"/>
       <w:r>
+        <w:rPr>
+          <w:rFonts w:asciiTheme="minorEastAsia" w:hAnsiTheme="minorEastAsia"/>
+          <w:szCs w:val="20"/>
+        </w:rPr>
         <w:t xml:space="preserve"> 자격요건·경력·임금 통계</w:t>
       </w:r>
     </w:p>
     <w:p>
-      <w:r>
+      <w:pPr>
+        <w:rPr>
+          <w:rFonts w:asciiTheme="minorEastAsia" w:hAnsiTheme="minorEastAsia"/>
+          <w:szCs w:val="20"/>
+        </w:rPr>
+      </w:pPr>
+      <w:r>
+        <w:rPr>
+          <w:rFonts w:asciiTheme="minorEastAsia" w:hAnsiTheme="minorEastAsia"/>
+          <w:szCs w:val="20"/>
+        </w:rPr>
         <w:t>2. 키워드 알람 &amp; 데일리 리포트 — 관심 키워드 등록 시 매일 트렌드 수신</w:t>
       </w:r>
     </w:p>
     <w:p>
-      <w:r>
+      <w:pPr>
+        <w:rPr>
+          <w:rFonts w:asciiTheme="minorEastAsia" w:hAnsiTheme="minorEastAsia"/>
+          <w:szCs w:val="20"/>
+        </w:rPr>
+      </w:pPr>
+      <w:r>
+        <w:rPr>
+          <w:rFonts w:asciiTheme="minorEastAsia" w:hAnsiTheme="minorEastAsia"/>
+          <w:szCs w:val="20"/>
+        </w:rPr>
         <w:t>3. 인접 직무 추천 — 내 스킬이 통하는 다른 직무 발견</w:t>
       </w:r>
     </w:p>
     <w:p>
-      <w:r>
+      <w:pPr>
+        <w:rPr>
+          <w:rFonts w:asciiTheme="minorEastAsia" w:hAnsiTheme="minorEastAsia"/>
+          <w:szCs w:val="20"/>
+        </w:rPr>
+      </w:pPr>
+      <w:r>
+        <w:rPr>
+          <w:rFonts w:asciiTheme="minorEastAsia" w:hAnsiTheme="minorEastAsia"/>
+          <w:szCs w:val="20"/>
+        </w:rPr>
         <w:t>4. AI 모의면접 — JD 기반 예상질문 생성 및 답변 피드백</w:t>
       </w:r>
     </w:p>
-    <w:p/>
-    <w:p>
-      <w:r>
+    <w:p>
+      <w:pPr>
+        <w:rPr>
+          <w:rFonts w:asciiTheme="minorEastAsia" w:hAnsiTheme="minorEastAsia"/>
+          <w:szCs w:val="20"/>
+        </w:rPr>
+      </w:pPr>
+    </w:p>
+    <w:p>
+      <w:pPr>
+        <w:rPr>
+          <w:rFonts w:asciiTheme="minorEastAsia" w:hAnsiTheme="minorEastAsia"/>
+          <w:szCs w:val="20"/>
+        </w:rPr>
+      </w:pPr>
+      <w:r>
+        <w:rPr>
+          <w:rFonts w:asciiTheme="minorEastAsia" w:hAnsiTheme="minorEastAsia"/>
+          <w:szCs w:val="20"/>
+        </w:rPr>
         <w:t>## 사용 기술</w:t>
       </w:r>
     </w:p>
     <w:p>
+      <w:pPr>
+        <w:rPr>
+          <w:rFonts w:asciiTheme="minorEastAsia" w:hAnsiTheme="minorEastAsia"/>
+          <w:szCs w:val="20"/>
+        </w:rPr>
+      </w:pPr>
       <w:proofErr w:type="spellStart"/>
       <w:r>
+        <w:rPr>
+          <w:rFonts w:asciiTheme="minorEastAsia" w:hAnsiTheme="minorEastAsia"/>
+          <w:szCs w:val="20"/>
+        </w:rPr>
         <w:t>React+Vite</w:t>
       </w:r>
       <w:proofErr w:type="spellEnd"/>
       <w:r>
+        <w:rPr>
+          <w:rFonts w:asciiTheme="minorEastAsia" w:hAnsiTheme="minorEastAsia"/>
+          <w:szCs w:val="20"/>
+        </w:rPr>
         <w:t xml:space="preserve">, </w:t>
       </w:r>
       <w:proofErr w:type="spellStart"/>
       <w:r>
+        <w:rPr>
+          <w:rFonts w:asciiTheme="minorEastAsia" w:hAnsiTheme="minorEastAsia"/>
+          <w:szCs w:val="20"/>
+        </w:rPr>
         <w:t>Vercel</w:t>
       </w:r>
       <w:proofErr w:type="spellEnd"/>
       <w:r>
+        <w:rPr>
+          <w:rFonts w:asciiTheme="minorEastAsia" w:hAnsiTheme="minorEastAsia"/>
+          <w:szCs w:val="20"/>
+        </w:rPr>
         <w:t xml:space="preserve"> Serverless, Neon DB, Claude API</w:t>
       </w:r>
     </w:p>
-    <w:p/>
-    <w:p>
-      <w:r>
+    <w:p>
+      <w:pPr>
+        <w:rPr>
+          <w:rFonts w:asciiTheme="minorEastAsia" w:hAnsiTheme="minorEastAsia"/>
+          <w:szCs w:val="20"/>
+        </w:rPr>
+      </w:pPr>
+    </w:p>
+    <w:p>
+      <w:pPr>
+        <w:rPr>
+          <w:rFonts w:asciiTheme="minorEastAsia" w:hAnsiTheme="minorEastAsia"/>
+          <w:szCs w:val="20"/>
+        </w:rPr>
+      </w:pPr>
+      <w:r>
+        <w:rPr>
+          <w:rFonts w:asciiTheme="minorEastAsia" w:hAnsiTheme="minorEastAsia"/>
+          <w:szCs w:val="20"/>
+        </w:rPr>
         <w:t>## AI 활용 내용</w:t>
       </w:r>
     </w:p>
     <w:p>
-      <w:r>
+      <w:pPr>
+        <w:rPr>
+          <w:rFonts w:asciiTheme="minorEastAsia" w:hAnsiTheme="minorEastAsia"/>
+          <w:szCs w:val="20"/>
+        </w:rPr>
+      </w:pPr>
+      <w:r>
+        <w:rPr>
+          <w:rFonts w:asciiTheme="minorEastAsia" w:hAnsiTheme="minorEastAsia"/>
+          <w:szCs w:val="20"/>
+        </w:rPr>
         <w:t>- 기획: Claude로 시장조사·BMC·페르소나 설계, API 전환 분석</w:t>
       </w:r>
     </w:p>
     <w:p>
-      <w:r>
+      <w:pPr>
+        <w:rPr>
+          <w:rFonts w:asciiTheme="minorEastAsia" w:hAnsiTheme="minorEastAsia"/>
+          <w:szCs w:val="20"/>
+        </w:rPr>
+      </w:pPr>
+      <w:r>
+        <w:rPr>
+          <w:rFonts w:asciiTheme="minorEastAsia" w:hAnsiTheme="minorEastAsia"/>
+          <w:szCs w:val="20"/>
+        </w:rPr>
         <w:t>- 구현: Claude Code로 API연동·DB스키마·파이프라인 구현</w:t>
       </w:r>
     </w:p>
     <w:p>
-      <w:r>
+      <w:pPr>
+        <w:rPr>
+          <w:rFonts w:asciiTheme="minorEastAsia" w:hAnsiTheme="minorEastAsia"/>
+          <w:szCs w:val="20"/>
+        </w:rPr>
+      </w:pPr>
+      <w:r>
+        <w:rPr>
+          <w:rFonts w:asciiTheme="minorEastAsia" w:hAnsiTheme="minorEastAsia"/>
+          <w:szCs w:val="20"/>
+        </w:rPr>
         <w:t>- 서비스 내: Claude API가 실시간으로 모의면접 질문 생성</w:t>
       </w:r>
     </w:p>
-    <w:p/>
-    <w:p>
-      <w:r>
+    <w:p>
+      <w:pPr>
+        <w:rPr>
+          <w:rFonts w:asciiTheme="minorEastAsia" w:hAnsiTheme="minorEastAsia"/>
+          <w:szCs w:val="20"/>
+        </w:rPr>
+      </w:pPr>
+    </w:p>
+    <w:p>
+      <w:pPr>
+        <w:rPr>
+          <w:rFonts w:asciiTheme="minorEastAsia" w:hAnsiTheme="minorEastAsia"/>
+          <w:szCs w:val="20"/>
+        </w:rPr>
+      </w:pPr>
+      <w:r>
+        <w:rPr>
+          <w:rFonts w:asciiTheme="minorEastAsia" w:hAnsiTheme="minorEastAsia"/>
+          <w:szCs w:val="20"/>
+        </w:rPr>
         <w:t>## API 활용 내용</w:t>
       </w:r>
     </w:p>
     <w:p>
-      <w:r>
-        <w:rPr>
-          <w:rFonts w:hint="eastAsia"/>
+      <w:pPr>
+        <w:rPr>
+          <w:rFonts w:asciiTheme="minorEastAsia" w:hAnsiTheme="minorEastAsia"/>
+          <w:szCs w:val="20"/>
+        </w:rPr>
+      </w:pPr>
+      <w:r>
+        <w:rPr>
+          <w:rFonts w:asciiTheme="minorEastAsia" w:hAnsiTheme="minorEastAsia" w:hint="eastAsia"/>
+          <w:szCs w:val="20"/>
         </w:rPr>
         <w:t>고용</w:t>
       </w:r>
       <w:r>
+        <w:rPr>
+          <w:rFonts w:asciiTheme="minorEastAsia" w:hAnsiTheme="minorEastAsia"/>
+          <w:szCs w:val="20"/>
+        </w:rPr>
         <w:t>24(</w:t>
       </w:r>
       <w:proofErr w:type="spellStart"/>
       <w:r>
+        <w:rPr>
+          <w:rFonts w:asciiTheme="minorEastAsia" w:hAnsiTheme="minorEastAsia"/>
+          <w:szCs w:val="20"/>
+        </w:rPr>
         <w:t>워크넷</w:t>
       </w:r>
       <w:proofErr w:type="spellEnd"/>
       <w:r>
+        <w:rPr>
+          <w:rFonts w:asciiTheme="minorEastAsia" w:hAnsiTheme="minorEastAsia"/>
+          <w:szCs w:val="20"/>
+        </w:rPr>
         <w:t>) Open API — 채용공고 실시간 수집</w:t>
       </w:r>
     </w:p>
     <w:p>
-      <w:r>
+      <w:pPr>
+        <w:rPr>
+          <w:rFonts w:asciiTheme="minorEastAsia" w:hAnsiTheme="minorEastAsia"/>
+          <w:szCs w:val="20"/>
+        </w:rPr>
+      </w:pPr>
+      <w:r>
+        <w:rPr>
+          <w:rFonts w:asciiTheme="minorEastAsia" w:hAnsiTheme="minorEastAsia"/>
+          <w:szCs w:val="20"/>
+        </w:rPr>
         <w:lastRenderedPageBreak/>
         <w:t>(사람인·</w:t>
       </w:r>
       <w:proofErr w:type="spellStart"/>
       <w:r>
+        <w:rPr>
+          <w:rFonts w:asciiTheme="minorEastAsia" w:hAnsiTheme="minorEastAsia"/>
+          <w:szCs w:val="20"/>
+        </w:rPr>
         <w:t>잡코리아</w:t>
       </w:r>
       <w:proofErr w:type="spellEnd"/>
       <w:r>
+        <w:rPr>
+          <w:rFonts w:asciiTheme="minorEastAsia" w:hAnsiTheme="minorEastAsia"/>
+          <w:szCs w:val="20"/>
+        </w:rPr>
         <w:t xml:space="preserve"> API 승인 실패 → 공공데이터로 전환한 과정 포함)</w:t>
       </w:r>
     </w:p>
-    <w:p/>
-    <w:p>
-      <w:r>
+    <w:p>
+      <w:pPr>
+        <w:rPr>
+          <w:rFonts w:asciiTheme="minorEastAsia" w:hAnsiTheme="minorEastAsia"/>
+          <w:szCs w:val="20"/>
+        </w:rPr>
+      </w:pPr>
+    </w:p>
+    <w:p>
+      <w:pPr>
+        <w:rPr>
+          <w:rFonts w:asciiTheme="minorEastAsia" w:hAnsiTheme="minorEastAsia"/>
+          <w:szCs w:val="20"/>
+        </w:rPr>
+      </w:pPr>
+      <w:r>
+        <w:rPr>
+          <w:rFonts w:asciiTheme="minorEastAsia" w:hAnsiTheme="minorEastAsia"/>
+          <w:szCs w:val="20"/>
+        </w:rPr>
         <w:t>## 주요 화면</w:t>
       </w:r>
     </w:p>
     <w:p>
-      <w:r>
+      <w:pPr>
+        <w:rPr>
+          <w:rFonts w:asciiTheme="minorEastAsia" w:hAnsiTheme="minorEastAsia"/>
+          <w:szCs w:val="20"/>
+        </w:rPr>
+      </w:pPr>
+      <w:r>
+        <w:rPr>
+          <w:rFonts w:asciiTheme="minorEastAsia" w:hAnsiTheme="minorEastAsia"/>
+          <w:szCs w:val="20"/>
+        </w:rPr>
         <w:t>[트렌드 대시보드 스크린샷] [모의면접 화면 스크린샷]</w:t>
       </w:r>
     </w:p>
-    <w:p/>
-    <w:p>
-      <w:r>
+    <w:p>
+      <w:pPr>
+        <w:rPr>
+          <w:rFonts w:asciiTheme="minorEastAsia" w:hAnsiTheme="minorEastAsia"/>
+          <w:szCs w:val="20"/>
+        </w:rPr>
+      </w:pPr>
+    </w:p>
+    <w:p>
+      <w:pPr>
+        <w:rPr>
+          <w:rFonts w:asciiTheme="minorEastAsia" w:hAnsiTheme="minorEastAsia"/>
+          <w:szCs w:val="20"/>
+        </w:rPr>
+      </w:pPr>
+      <w:r>
+        <w:rPr>
+          <w:rFonts w:asciiTheme="minorEastAsia" w:hAnsiTheme="minorEastAsia"/>
+          <w:szCs w:val="20"/>
+        </w:rPr>
         <w:t>## 기대 효과</w:t>
       </w:r>
     </w:p>
     <w:p>
-      <w:r>
-        <w:rPr>
-          <w:rFonts w:hint="eastAsia"/>
+      <w:pPr>
+        <w:rPr>
+          <w:rFonts w:asciiTheme="minorEastAsia" w:hAnsiTheme="minorEastAsia"/>
+          <w:szCs w:val="20"/>
+        </w:rPr>
+      </w:pPr>
+      <w:r>
+        <w:rPr>
+          <w:rFonts w:asciiTheme="minorEastAsia" w:hAnsiTheme="minorEastAsia" w:hint="eastAsia"/>
+          <w:szCs w:val="20"/>
         </w:rPr>
         <w:t>구직자의</w:t>
       </w:r>
       <w:r>
+        <w:rPr>
+          <w:rFonts w:asciiTheme="minorEastAsia" w:hAnsiTheme="minorEastAsia"/>
+          <w:szCs w:val="20"/>
+        </w:rPr>
         <w:t xml:space="preserve"> 정보 탐색 시간 단축, 인접 직무 발견을 통한 지원 기회 확대</w:t>
       </w:r>
     </w:p>
-    <w:p/>
-    <w:p>
-      <w:r>
+    <w:p>
+      <w:pPr>
+        <w:rPr>
+          <w:rFonts w:asciiTheme="minorEastAsia" w:hAnsiTheme="minorEastAsia"/>
+          <w:szCs w:val="20"/>
+        </w:rPr>
+      </w:pPr>
+    </w:p>
+    <w:p>
+      <w:pPr>
+        <w:rPr>
+          <w:rFonts w:asciiTheme="minorEastAsia" w:hAnsiTheme="minorEastAsia"/>
+          <w:szCs w:val="20"/>
+        </w:rPr>
+      </w:pPr>
+      <w:r>
+        <w:rPr>
+          <w:rFonts w:asciiTheme="minorEastAsia" w:hAnsiTheme="minorEastAsia"/>
+          <w:szCs w:val="20"/>
+        </w:rPr>
         <w:t>## 향후 발전 방향</w:t>
       </w:r>
     </w:p>
     <w:p>
-      <w:r>
+      <w:pPr>
+        <w:rPr>
+          <w:rFonts w:asciiTheme="minorEastAsia" w:hAnsiTheme="minorEastAsia"/>
+          <w:szCs w:val="20"/>
+        </w:rPr>
+      </w:pPr>
+      <w:r>
+        <w:rPr>
+          <w:rFonts w:asciiTheme="minorEastAsia" w:hAnsiTheme="minorEastAsia"/>
+          <w:szCs w:val="20"/>
+        </w:rPr>
         <w:t>NCS 역량데이터 통합, 직업적성검사 연동, 음성 모의면접</w:t>
       </w:r>
+    </w:p>
+    <w:p>
+      <w:pPr>
+        <w:rPr>
+          <w:rFonts w:asciiTheme="minorEastAsia" w:hAnsiTheme="minorEastAsia"/>
+          <w:szCs w:val="20"/>
+        </w:rPr>
+      </w:pPr>
+    </w:p>
+    <w:p>
+      <w:pPr>
+        <w:rPr>
+          <w:rFonts w:asciiTheme="minorEastAsia" w:hAnsiTheme="minorEastAsia"/>
+          <w:szCs w:val="20"/>
+        </w:rPr>
+      </w:pPr>
+    </w:p>
+    <w:p>
+      <w:pPr>
+        <w:widowControl/>
+        <w:wordWrap/>
+        <w:autoSpaceDE/>
+        <w:autoSpaceDN/>
+        <w:spacing w:before="100" w:beforeAutospacing="1" w:after="100" w:afterAutospacing="1" w:line="240" w:lineRule="auto"/>
+        <w:ind w:left="1000" w:hanging="400"/>
+        <w:jc w:val="left"/>
+        <w:outlineLvl w:val="2"/>
+        <w:rPr>
+          <w:rFonts w:asciiTheme="minorEastAsia" w:hAnsiTheme="minorEastAsia" w:cs="굴림"/>
+          <w:b/>
+          <w:bCs/>
+          <w:kern w:val="0"/>
+          <w:szCs w:val="20"/>
+        </w:rPr>
+      </w:pPr>
+      <w:r>
+        <w:rPr>
+          <w:rFonts w:asciiTheme="minorEastAsia" w:hAnsiTheme="minorEastAsia" w:cs="굴림"/>
+          <w:b/>
+          <w:bCs/>
+          <w:kern w:val="0"/>
+          <w:szCs w:val="20"/>
+        </w:rPr>
+        <w:t>5. 발표 구성 — 회고에 "API 전환 스토리" 명시 배치</w:t>
+      </w:r>
+    </w:p>
+    <w:p>
+      <w:pPr>
+        <w:widowControl/>
+        <w:wordWrap/>
+        <w:autoSpaceDE/>
+        <w:autoSpaceDN/>
+        <w:spacing w:before="100" w:beforeAutospacing="1" w:after="100" w:afterAutospacing="1" w:line="240" w:lineRule="auto"/>
+        <w:jc w:val="left"/>
+        <w:rPr>
+          <w:rFonts w:asciiTheme="minorEastAsia" w:hAnsiTheme="minorEastAsia" w:cs="굴림"/>
+          <w:kern w:val="0"/>
+          <w:szCs w:val="20"/>
+        </w:rPr>
+      </w:pPr>
+      <w:r>
+        <w:rPr>
+          <w:rFonts w:asciiTheme="minorEastAsia" w:hAnsiTheme="minorEastAsia" w:cs="굴림"/>
+          <w:kern w:val="0"/>
+          <w:szCs w:val="20"/>
+        </w:rPr>
+        <w:t xml:space="preserve">가이드의 발표 5단계 구조에 맞춰, 특히 5번(회고) 슬라이드 내용을 구체적으로 </w:t>
+      </w:r>
+      <w:proofErr w:type="spellStart"/>
+      <w:r>
+        <w:rPr>
+          <w:rFonts w:asciiTheme="minorEastAsia" w:hAnsiTheme="minorEastAsia" w:cs="굴림"/>
+          <w:kern w:val="0"/>
+          <w:szCs w:val="20"/>
+        </w:rPr>
+        <w:t>정해둡니다</w:t>
+      </w:r>
+      <w:proofErr w:type="spellEnd"/>
+      <w:r>
+        <w:rPr>
+          <w:rFonts w:asciiTheme="minorEastAsia" w:hAnsiTheme="minorEastAsia" w:cs="굴림"/>
+          <w:kern w:val="0"/>
+          <w:szCs w:val="20"/>
+        </w:rPr>
+        <w:t>.</w:t>
+      </w:r>
+    </w:p>
+    <w:p>
+      <w:pPr>
+        <w:widowControl/>
+        <w:wordWrap/>
+        <w:autoSpaceDE/>
+        <w:autoSpaceDN/>
+        <w:spacing w:before="100" w:beforeAutospacing="1" w:after="100" w:afterAutospacing="1" w:line="240" w:lineRule="auto"/>
+        <w:jc w:val="left"/>
+        <w:rPr>
+          <w:rFonts w:asciiTheme="minorEastAsia" w:hAnsiTheme="minorEastAsia" w:cs="굴림"/>
+          <w:kern w:val="0"/>
+          <w:szCs w:val="20"/>
+        </w:rPr>
+      </w:pPr>
+      <w:r>
+        <w:rPr>
+          <w:rFonts w:asciiTheme="minorEastAsia" w:hAnsiTheme="minorEastAsia" w:cs="굴림"/>
+          <w:b/>
+          <w:bCs/>
+          <w:kern w:val="0"/>
+          <w:szCs w:val="20"/>
+        </w:rPr>
+        <w:t>1. 프로젝트 소개 (30초)</w:t>
+      </w:r>
+      <w:r>
+        <w:rPr>
+          <w:rFonts w:asciiTheme="minorEastAsia" w:hAnsiTheme="minorEastAsia" w:cs="굴림"/>
+          <w:kern w:val="0"/>
+          <w:szCs w:val="20"/>
+        </w:rPr>
+        <w:t xml:space="preserve"> — 프로젝트명, 한 줄 문제정의</w:t>
+      </w:r>
+    </w:p>
+    <w:p>
+      <w:pPr>
+        <w:widowControl/>
+        <w:wordWrap/>
+        <w:autoSpaceDE/>
+        <w:autoSpaceDN/>
+        <w:spacing w:before="100" w:beforeAutospacing="1" w:after="100" w:afterAutospacing="1" w:line="240" w:lineRule="auto"/>
+        <w:jc w:val="left"/>
+        <w:rPr>
+          <w:rFonts w:asciiTheme="minorEastAsia" w:hAnsiTheme="minorEastAsia" w:cs="굴림"/>
+          <w:kern w:val="0"/>
+          <w:szCs w:val="20"/>
+        </w:rPr>
+      </w:pPr>
+      <w:r>
+        <w:rPr>
+          <w:rFonts w:asciiTheme="minorEastAsia" w:hAnsiTheme="minorEastAsia" w:cs="굴림"/>
+          <w:b/>
+          <w:bCs/>
+          <w:kern w:val="0"/>
+          <w:szCs w:val="20"/>
+        </w:rPr>
+        <w:t>2. 기획 (1분)</w:t>
+      </w:r>
+      <w:r>
+        <w:rPr>
+          <w:rFonts w:asciiTheme="minorEastAsia" w:hAnsiTheme="minorEastAsia" w:cs="굴림"/>
+          <w:kern w:val="0"/>
+          <w:szCs w:val="20"/>
+        </w:rPr>
+        <w:t xml:space="preserve"> — 시장조사 핵심 수치 1~2개, 경쟁서비스 대비 </w:t>
+      </w:r>
+      <w:proofErr w:type="spellStart"/>
+      <w:r>
+        <w:rPr>
+          <w:rFonts w:asciiTheme="minorEastAsia" w:hAnsiTheme="minorEastAsia" w:cs="굴림"/>
+          <w:kern w:val="0"/>
+          <w:szCs w:val="20"/>
+        </w:rPr>
+        <w:t>차별점</w:t>
+      </w:r>
+      <w:proofErr w:type="spellEnd"/>
+      <w:r>
+        <w:rPr>
+          <w:rFonts w:asciiTheme="minorEastAsia" w:hAnsiTheme="minorEastAsia" w:cs="굴림"/>
+          <w:kern w:val="0"/>
+          <w:szCs w:val="20"/>
+        </w:rPr>
+        <w:t>, 페르소나 1명만 짚기</w:t>
+      </w:r>
+    </w:p>
+    <w:p>
+      <w:pPr>
+        <w:widowControl/>
+        <w:wordWrap/>
+        <w:autoSpaceDE/>
+        <w:autoSpaceDN/>
+        <w:spacing w:before="100" w:beforeAutospacing="1" w:after="100" w:afterAutospacing="1" w:line="240" w:lineRule="auto"/>
+        <w:jc w:val="left"/>
+        <w:rPr>
+          <w:rFonts w:asciiTheme="minorEastAsia" w:hAnsiTheme="minorEastAsia" w:cs="굴림"/>
+          <w:kern w:val="0"/>
+          <w:szCs w:val="20"/>
+        </w:rPr>
+      </w:pPr>
+      <w:r>
+        <w:rPr>
+          <w:rFonts w:asciiTheme="minorEastAsia" w:hAnsiTheme="minorEastAsia" w:cs="굴림"/>
+          <w:b/>
+          <w:bCs/>
+          <w:kern w:val="0"/>
+          <w:szCs w:val="20"/>
+        </w:rPr>
+        <w:t>3. 기술 구현 (1.5분)</w:t>
+      </w:r>
+      <w:r>
+        <w:rPr>
+          <w:rFonts w:asciiTheme="minorEastAsia" w:hAnsiTheme="minorEastAsia" w:cs="굴림"/>
+          <w:kern w:val="0"/>
+          <w:szCs w:val="20"/>
+        </w:rPr>
+        <w:t xml:space="preserve"> — 시스템구조 다이어그램 1장, "AI를 이렇게 썼다" 캡처 2장 보여주기</w:t>
+      </w:r>
+    </w:p>
+    <w:p>
+      <w:pPr>
+        <w:widowControl/>
+        <w:wordWrap/>
+        <w:autoSpaceDE/>
+        <w:autoSpaceDN/>
+        <w:spacing w:before="100" w:beforeAutospacing="1" w:after="100" w:afterAutospacing="1" w:line="240" w:lineRule="auto"/>
+        <w:jc w:val="left"/>
+        <w:rPr>
+          <w:rFonts w:asciiTheme="minorEastAsia" w:hAnsiTheme="minorEastAsia" w:cs="굴림"/>
+          <w:kern w:val="0"/>
+          <w:szCs w:val="20"/>
+        </w:rPr>
+      </w:pPr>
+      <w:r>
+        <w:rPr>
+          <w:rFonts w:asciiTheme="minorEastAsia" w:hAnsiTheme="minorEastAsia" w:cs="굴림"/>
+          <w:b/>
+          <w:bCs/>
+          <w:kern w:val="0"/>
+          <w:szCs w:val="20"/>
+        </w:rPr>
+        <w:t>4. 서비스 시연 (2~2.5분)</w:t>
+      </w:r>
+      <w:r>
+        <w:rPr>
+          <w:rFonts w:asciiTheme="minorEastAsia" w:hAnsiTheme="minorEastAsia" w:cs="굴림"/>
+          <w:kern w:val="0"/>
+          <w:szCs w:val="20"/>
+        </w:rPr>
+        <w:t xml:space="preserve"> — F1→F4 순서로 실제 화면 데모, 가장 잘 동작하는 기능부터</w:t>
+      </w:r>
+    </w:p>
+    <w:p>
+      <w:pPr>
+        <w:widowControl/>
+        <w:wordWrap/>
+        <w:autoSpaceDE/>
+        <w:autoSpaceDN/>
+        <w:spacing w:before="100" w:beforeAutospacing="1" w:after="100" w:afterAutospacing="1" w:line="240" w:lineRule="auto"/>
+        <w:jc w:val="left"/>
+        <w:rPr>
+          <w:rFonts w:asciiTheme="minorEastAsia" w:hAnsiTheme="minorEastAsia" w:cs="굴림"/>
+          <w:kern w:val="0"/>
+          <w:szCs w:val="20"/>
+        </w:rPr>
+      </w:pPr>
+      <w:r>
+        <w:rPr>
+          <w:rFonts w:asciiTheme="minorEastAsia" w:hAnsiTheme="minorEastAsia" w:cs="굴림"/>
+          <w:b/>
+          <w:bCs/>
+          <w:kern w:val="0"/>
+          <w:szCs w:val="20"/>
+        </w:rPr>
+        <w:t>5. 회고 (1~1.5분) — 아래 3가지를 반드시 포함</w:t>
+      </w:r>
+    </w:p>
+    <w:p>
+      <w:pPr>
+        <w:widowControl/>
+        <w:numPr>
+          <w:ilvl w:val="0"/>
+          <w:numId w:val="1"/>
+        </w:numPr>
+        <w:wordWrap/>
+        <w:autoSpaceDE/>
+        <w:autoSpaceDN/>
+        <w:spacing w:before="100" w:beforeAutospacing="1" w:after="100" w:afterAutospacing="1" w:line="240" w:lineRule="auto"/>
+        <w:jc w:val="left"/>
+        <w:rPr>
+          <w:rFonts w:asciiTheme="minorEastAsia" w:hAnsiTheme="minorEastAsia" w:cs="굴림"/>
+          <w:kern w:val="0"/>
+          <w:szCs w:val="20"/>
+        </w:rPr>
+      </w:pPr>
+      <w:r>
+        <w:rPr>
+          <w:rFonts w:asciiTheme="minorEastAsia" w:hAnsiTheme="minorEastAsia" w:cs="굴림"/>
+          <w:b/>
+          <w:bCs/>
+          <w:kern w:val="0"/>
+          <w:szCs w:val="20"/>
+        </w:rPr>
+        <w:t>어려웠던 점</w:t>
+      </w:r>
+      <w:r>
+        <w:rPr>
+          <w:rFonts w:asciiTheme="minorEastAsia" w:hAnsiTheme="minorEastAsia" w:cs="굴림"/>
+          <w:kern w:val="0"/>
+          <w:szCs w:val="20"/>
+        </w:rPr>
+        <w:t>: "사람인·</w:t>
+      </w:r>
+      <w:proofErr w:type="spellStart"/>
+      <w:r>
+        <w:rPr>
+          <w:rFonts w:asciiTheme="minorEastAsia" w:hAnsiTheme="minorEastAsia" w:cs="굴림"/>
+          <w:kern w:val="0"/>
+          <w:szCs w:val="20"/>
+        </w:rPr>
+        <w:t>잡코리아</w:t>
+      </w:r>
+      <w:proofErr w:type="spellEnd"/>
+      <w:r>
+        <w:rPr>
+          <w:rFonts w:asciiTheme="minorEastAsia" w:hAnsiTheme="minorEastAsia" w:cs="굴림"/>
+          <w:kern w:val="0"/>
+          <w:szCs w:val="20"/>
+        </w:rPr>
+        <w:t xml:space="preserve"> API를 신청했지만 </w:t>
+      </w:r>
+      <w:proofErr w:type="spellStart"/>
+      <w:r>
+        <w:rPr>
+          <w:rFonts w:asciiTheme="minorEastAsia" w:hAnsiTheme="minorEastAsia" w:cs="굴림"/>
+          <w:kern w:val="0"/>
+          <w:szCs w:val="20"/>
+        </w:rPr>
+        <w:t>승인받지</w:t>
+      </w:r>
+      <w:proofErr w:type="spellEnd"/>
+      <w:r>
+        <w:rPr>
+          <w:rFonts w:asciiTheme="minorEastAsia" w:hAnsiTheme="minorEastAsia" w:cs="굴림"/>
+          <w:kern w:val="0"/>
+          <w:szCs w:val="20"/>
+        </w:rPr>
+        <w:t xml:space="preserve"> 못했다"</w:t>
+      </w:r>
+    </w:p>
+    <w:p>
+      <w:pPr>
+        <w:widowControl/>
+        <w:numPr>
+          <w:ilvl w:val="0"/>
+          <w:numId w:val="1"/>
+        </w:numPr>
+        <w:wordWrap/>
+        <w:autoSpaceDE/>
+        <w:autoSpaceDN/>
+        <w:spacing w:before="100" w:beforeAutospacing="1" w:after="100" w:afterAutospacing="1" w:line="240" w:lineRule="auto"/>
+        <w:jc w:val="left"/>
+        <w:rPr>
+          <w:rFonts w:asciiTheme="minorEastAsia" w:hAnsiTheme="minorEastAsia" w:cs="굴림"/>
+          <w:kern w:val="0"/>
+          <w:szCs w:val="20"/>
+        </w:rPr>
+      </w:pPr>
+      <w:r>
+        <w:rPr>
+          <w:rFonts w:asciiTheme="minorEastAsia" w:hAnsiTheme="minorEastAsia" w:cs="굴림"/>
+          <w:b/>
+          <w:bCs/>
+          <w:kern w:val="0"/>
+          <w:szCs w:val="20"/>
+        </w:rPr>
+        <w:t>AI 협업 경험</w:t>
+      </w:r>
+      <w:r>
+        <w:rPr>
+          <w:rFonts w:asciiTheme="minorEastAsia" w:hAnsiTheme="minorEastAsia" w:cs="굴림"/>
+          <w:kern w:val="0"/>
+          <w:szCs w:val="20"/>
+        </w:rPr>
+        <w:t>: "Claude와 함께 고용24(</w:t>
+      </w:r>
+      <w:proofErr w:type="spellStart"/>
+      <w:r>
+        <w:rPr>
+          <w:rFonts w:asciiTheme="minorEastAsia" w:hAnsiTheme="minorEastAsia" w:cs="굴림"/>
+          <w:kern w:val="0"/>
+          <w:szCs w:val="20"/>
+        </w:rPr>
+        <w:t>워크넷</w:t>
+      </w:r>
+      <w:proofErr w:type="spellEnd"/>
+      <w:r>
+        <w:rPr>
+          <w:rFonts w:asciiTheme="minorEastAsia" w:hAnsiTheme="minorEastAsia" w:cs="굴림"/>
+          <w:kern w:val="0"/>
+          <w:szCs w:val="20"/>
+        </w:rPr>
+        <w:t>) 공공데이터로 전환을 결정했고, 실제 XML 응답 구조를 찾아 필드를 매핑하는 과정에서 Claude Code의 도움을 받았다"</w:t>
+      </w:r>
+    </w:p>
+    <w:p>
+      <w:pPr>
+        <w:widowControl/>
+        <w:numPr>
+          <w:ilvl w:val="0"/>
+          <w:numId w:val="1"/>
+        </w:numPr>
+        <w:wordWrap/>
+        <w:autoSpaceDE/>
+        <w:autoSpaceDN/>
+        <w:spacing w:before="100" w:beforeAutospacing="1" w:after="100" w:afterAutospacing="1" w:line="240" w:lineRule="auto"/>
+        <w:jc w:val="left"/>
+        <w:rPr>
+          <w:rFonts w:asciiTheme="minorEastAsia" w:hAnsiTheme="minorEastAsia" w:cs="굴림"/>
+          <w:kern w:val="0"/>
+          <w:szCs w:val="20"/>
+        </w:rPr>
+      </w:pPr>
+      <w:r>
+        <w:rPr>
+          <w:rFonts w:asciiTheme="minorEastAsia" w:hAnsiTheme="minorEastAsia" w:cs="굴림"/>
+          <w:b/>
+          <w:bCs/>
+          <w:kern w:val="0"/>
+          <w:szCs w:val="20"/>
+        </w:rPr>
+        <w:t>개선 방향</w:t>
+      </w:r>
+      <w:r>
+        <w:rPr>
+          <w:rFonts w:asciiTheme="minorEastAsia" w:hAnsiTheme="minorEastAsia" w:cs="굴림"/>
+          <w:kern w:val="0"/>
+          <w:szCs w:val="20"/>
+        </w:rPr>
+        <w:t>: "시간이 더 있었다면 NCS 역량데이터를 모의면접에 통합하고 싶다"</w:t>
+      </w:r>
+    </w:p>
+    <w:bookmarkEnd w:id="0"/>
+    <w:p>
+      <w:pPr>
+        <w:rPr>
+          <w:rFonts w:asciiTheme="minorEastAsia" w:hAnsiTheme="minorEastAsia" w:hint="eastAsia"/>
+          <w:szCs w:val="20"/>
+        </w:rPr>
+      </w:pPr>
     </w:p>
     <w:sectPr>
       <w:pgSz w:w="11906" w:h="16838"/>
@@ -254,6 +1087,163 @@
     </w:sectPr>
   </w:body>
 </w:document>
+</file>
+
+<file path=word/numbering.xml><?xml version="1.0" encoding="utf-8"?>
+<w:numbering xmlns:wpc="http://schemas.microsoft.com/office/word/2010/wordprocessingCanvas" xmlns:cx="http://schemas.microsoft.com/office/drawing/2014/chartex" xmlns:cx1="http://schemas.microsoft.com/office/drawing/2015/9/8/chartex" xmlns:cx2="http://schemas.microsoft.com/office/drawing/2015/10/21/chartex" xmlns:cx3="http://schemas.microsoft.com/office/drawing/2016/5/9/chartex" xmlns:cx4="http://schemas.microsoft.com/office/drawing/2016/5/10/chartex" xmlns:cx5="http://schemas.microsoft.com/office/drawing/2016/5/11/chartex" xmlns:cx6="http://schemas.microsoft.com/office/drawing/2016/5/12/chartex" xmlns:cx7="http://schemas.microsoft.com/office/drawing/2016/5/13/chartex" xmlns:cx8="http://schemas.microsoft.com/office/drawing/2016/5/14/chartex" xmlns:mc="http://schemas.openxmlformats.org/markup-compatibility/2006" xmlns:aink="http://schemas.microsoft.com/office/drawing/2016/ink" xmlns:am3d="http://schemas.microsoft.com/office/drawing/2017/model3d" xmlns:o="urn:schemas-microsoft-com:office:office" xmlns:r="http://schemas.openxmlformats.org/officeDocument/2006/relationships" xmlns:m="http://schemas.openxmlformats.org/officeDocument/2006/math" xmlns:v="urn:schemas-microsoft-com:vml" xmlns:wp14="http://schemas.microsoft.com/office/word/2010/wordprocessingDrawing" xmlns:wp="http://schemas.openxmlformats.org/drawingml/2006/wordprocessingDrawing" xmlns:w10="urn:schemas-microsoft-com:office:word" xmlns:w="http://schemas.openxmlformats.org/wordprocessingml/2006/main" xmlns:w14="http://schemas.microsoft.com/office/word/2010/wordml" xmlns:w15="http://schemas.microsoft.com/office/word/2012/wordml" xmlns:w16cid="http://schemas.microsoft.com/office/word/2016/wordml/cid" xmlns:w16se="http://schemas.microsoft.com/office/word/2015/wordml/symex" xmlns:wpg="http://schemas.microsoft.com/office/word/2010/wordprocessingGroup" xmlns:wpi="http://schemas.microsoft.com/office/word/2010/wordprocessingInk" xmlns:wne="http://schemas.microsoft.com/office/word/2006/wordml" xmlns:wps="http://schemas.microsoft.com/office/word/2010/wordprocessingShape" mc:Ignorable="w14 w15 w16se w16cid wp14">
+  <w:abstractNum w:abstractNumId="0" w15:restartNumberingAfterBreak="0">
+    <w:nsid w:val="2D49061D"/>
+    <w:multiLevelType w:val="multilevel"/>
+    <w:tmpl w:val="6560A7B0"/>
+    <w:lvl w:ilvl="0">
+      <w:start w:val="1"/>
+      <w:numFmt w:val="bullet"/>
+      <w:lvlText w:val=""/>
+      <w:lvlJc w:val="left"/>
+      <w:pPr>
+        <w:tabs>
+          <w:tab w:val="num" w:pos="720"/>
+        </w:tabs>
+        <w:ind w:left="720" w:hanging="360"/>
+      </w:pPr>
+      <w:rPr>
+        <w:rFonts w:ascii="Symbol" w:hAnsi="Symbol" w:hint="default"/>
+        <w:sz w:val="20"/>
+      </w:rPr>
+    </w:lvl>
+    <w:lvl w:ilvl="1" w:tentative="1">
+      <w:start w:val="1"/>
+      <w:numFmt w:val="bullet"/>
+      <w:lvlText w:val="o"/>
+      <w:lvlJc w:val="left"/>
+      <w:pPr>
+        <w:tabs>
+          <w:tab w:val="num" w:pos="1440"/>
+        </w:tabs>
+        <w:ind w:left="1440" w:hanging="360"/>
+      </w:pPr>
+      <w:rPr>
+        <w:rFonts w:ascii="Courier New" w:hAnsi="Courier New" w:hint="default"/>
+        <w:sz w:val="20"/>
+      </w:rPr>
+    </w:lvl>
+    <w:lvl w:ilvl="2" w:tentative="1">
+      <w:start w:val="1"/>
+      <w:numFmt w:val="bullet"/>
+      <w:lvlText w:val=""/>
+      <w:lvlJc w:val="left"/>
+      <w:pPr>
+        <w:tabs>
+          <w:tab w:val="num" w:pos="2160"/>
+        </w:tabs>
+        <w:ind w:left="2160" w:hanging="360"/>
+      </w:pPr>
+      <w:rPr>
+        <w:rFonts w:ascii="Wingdings" w:hAnsi="Wingdings" w:hint="default"/>
+        <w:sz w:val="20"/>
+      </w:rPr>
+    </w:lvl>
+    <w:lvl w:ilvl="3" w:tentative="1">
+      <w:start w:val="1"/>
+      <w:numFmt w:val="bullet"/>
+      <w:lvlText w:val=""/>
+      <w:lvlJc w:val="left"/>
+      <w:pPr>
+        <w:tabs>
+          <w:tab w:val="num" w:pos="2880"/>
+        </w:tabs>
+        <w:ind w:left="2880" w:hanging="360"/>
+      </w:pPr>
+      <w:rPr>
+        <w:rFonts w:ascii="Wingdings" w:hAnsi="Wingdings" w:hint="default"/>
+        <w:sz w:val="20"/>
+      </w:rPr>
+    </w:lvl>
+    <w:lvl w:ilvl="4" w:tentative="1">
+      <w:start w:val="1"/>
+      <w:numFmt w:val="bullet"/>
+      <w:lvlText w:val=""/>
+      <w:lvlJc w:val="left"/>
+      <w:pPr>
+        <w:tabs>
+          <w:tab w:val="num" w:pos="3600"/>
+        </w:tabs>
+        <w:ind w:left="3600" w:hanging="360"/>
+      </w:pPr>
+      <w:rPr>
+        <w:rFonts w:ascii="Wingdings" w:hAnsi="Wingdings" w:hint="default"/>
+        <w:sz w:val="20"/>
+      </w:rPr>
+    </w:lvl>
+    <w:lvl w:ilvl="5" w:tentative="1">
+      <w:start w:val="1"/>
+      <w:numFmt w:val="bullet"/>
+      <w:lvlText w:val=""/>
+      <w:lvlJc w:val="left"/>
+      <w:pPr>
+        <w:tabs>
+          <w:tab w:val="num" w:pos="4320"/>
+        </w:tabs>
+        <w:ind w:left="4320" w:hanging="360"/>
+      </w:pPr>
+      <w:rPr>
+        <w:rFonts w:ascii="Wingdings" w:hAnsi="Wingdings" w:hint="default"/>
+        <w:sz w:val="20"/>
+      </w:rPr>
+    </w:lvl>
+    <w:lvl w:ilvl="6" w:tentative="1">
+      <w:start w:val="1"/>
+      <w:numFmt w:val="bullet"/>
+      <w:lvlText w:val=""/>
+      <w:lvlJc w:val="left"/>
+      <w:pPr>
+        <w:tabs>
+          <w:tab w:val="num" w:pos="5040"/>
+        </w:tabs>
+        <w:ind w:left="5040" w:hanging="360"/>
+      </w:pPr>
+      <w:rPr>
+        <w:rFonts w:ascii="Wingdings" w:hAnsi="Wingdings" w:hint="default"/>
+        <w:sz w:val="20"/>
+      </w:rPr>
+    </w:lvl>
+    <w:lvl w:ilvl="7" w:tentative="1">
+      <w:start w:val="1"/>
+      <w:numFmt w:val="bullet"/>
+      <w:lvlText w:val=""/>
+      <w:lvlJc w:val="left"/>
+      <w:pPr>
+        <w:tabs>
+          <w:tab w:val="num" w:pos="5760"/>
+        </w:tabs>
+        <w:ind w:left="5760" w:hanging="360"/>
+      </w:pPr>
+      <w:rPr>
+        <w:rFonts w:ascii="Wingdings" w:hAnsi="Wingdings" w:hint="default"/>
+        <w:sz w:val="20"/>
+      </w:rPr>
+    </w:lvl>
+    <w:lvl w:ilvl="8" w:tentative="1">
+      <w:start w:val="1"/>
+      <w:numFmt w:val="bullet"/>
+      <w:lvlText w:val=""/>
+      <w:lvlJc w:val="left"/>
+      <w:pPr>
+        <w:tabs>
+          <w:tab w:val="num" w:pos="6480"/>
+        </w:tabs>
+        <w:ind w:left="6480" w:hanging="360"/>
+      </w:pPr>
+      <w:rPr>
+        <w:rFonts w:ascii="Wingdings" w:hAnsi="Wingdings" w:hint="default"/>
+        <w:sz w:val="20"/>
+      </w:rPr>
+    </w:lvl>
+  </w:abstractNum>
+  <w:num w:numId="1">
+    <w:abstractNumId w:val="0"/>
+  </w:num>
+</w:numbering>
 </file>
 
 <file path=word/styles.xml><?xml version="1.0" encoding="utf-8"?>
@@ -661,6 +1651,31 @@
       <w:autoSpaceDN w:val="0"/>
     </w:pPr>
   </w:style>
+  <w:style w:type="paragraph" w:styleId="3">
+    <w:name w:val="heading 3"/>
+    <w:basedOn w:val="a"/>
+    <w:link w:val="3Char"/>
+    <w:uiPriority w:val="9"/>
+    <w:qFormat/>
+    <w:rsid w:val="004624E4"/>
+    <w:pPr>
+      <w:widowControl/>
+      <w:wordWrap/>
+      <w:autoSpaceDE/>
+      <w:autoSpaceDN/>
+      <w:spacing w:before="100" w:beforeAutospacing="1" w:after="100" w:afterAutospacing="1" w:line="240" w:lineRule="auto"/>
+      <w:jc w:val="left"/>
+      <w:outlineLvl w:val="2"/>
+    </w:pPr>
+    <w:rPr>
+      <w:rFonts w:ascii="굴림" w:eastAsia="굴림" w:hAnsi="굴림" w:cs="굴림"/>
+      <w:b/>
+      <w:bCs/>
+      <w:kern w:val="0"/>
+      <w:sz w:val="27"/>
+      <w:szCs w:val="27"/>
+    </w:rPr>
+  </w:style>
   <w:style w:type="character" w:default="1" w:styleId="a0">
     <w:name w:val="Default Paragraph Font"/>
     <w:uiPriority w:val="1"/>
@@ -687,6 +1702,51 @@
     <w:uiPriority w:val="99"/>
     <w:semiHidden/>
     <w:unhideWhenUsed/>
+  </w:style>
+  <w:style w:type="character" w:customStyle="1" w:styleId="3Char">
+    <w:name w:val="제목 3 Char"/>
+    <w:basedOn w:val="a0"/>
+    <w:link w:val="3"/>
+    <w:uiPriority w:val="9"/>
+    <w:rsid w:val="004624E4"/>
+    <w:rPr>
+      <w:rFonts w:ascii="굴림" w:eastAsia="굴림" w:hAnsi="굴림" w:cs="굴림"/>
+      <w:b/>
+      <w:bCs/>
+      <w:kern w:val="0"/>
+      <w:sz w:val="27"/>
+      <w:szCs w:val="27"/>
+    </w:rPr>
+  </w:style>
+  <w:style w:type="paragraph" w:customStyle="1" w:styleId="font-claude-response-body">
+    <w:name w:val="font-claude-response-body"/>
+    <w:basedOn w:val="a"/>
+    <w:rsid w:val="004624E4"/>
+    <w:pPr>
+      <w:widowControl/>
+      <w:wordWrap/>
+      <w:autoSpaceDE/>
+      <w:autoSpaceDN/>
+      <w:spacing w:before="100" w:beforeAutospacing="1" w:after="100" w:afterAutospacing="1" w:line="240" w:lineRule="auto"/>
+      <w:jc w:val="left"/>
+    </w:pPr>
+    <w:rPr>
+      <w:rFonts w:ascii="굴림" w:eastAsia="굴림" w:hAnsi="굴림" w:cs="굴림"/>
+      <w:kern w:val="0"/>
+      <w:sz w:val="24"/>
+      <w:szCs w:val="24"/>
+    </w:rPr>
+  </w:style>
+  <w:style w:type="character" w:styleId="a3">
+    <w:name w:val="Strong"/>
+    <w:basedOn w:val="a0"/>
+    <w:uiPriority w:val="22"/>
+    <w:qFormat/>
+    <w:rsid w:val="004624E4"/>
+    <w:rPr>
+      <w:b/>
+      <w:bCs/>
+    </w:rPr>
   </w:style>
 </w:styles>
 </file>

</xml_diff>